<commit_message>
docs(order): publish localized terminology
</commit_message>
<xml_diff>
--- a/requirements/downloads/11_订单管理_PRD_V2.0.docx
+++ b/requirements/downloads/11_订单管理_PRD_V2.0.docx
@@ -237,7 +237,7 @@
                 <w:color w:val="000000"/>
                 <w:sz w:val="18"/>
               </w:rPr>
-              <w:t>订单总览、分类和组合筛选、搜索和排序、订单卡片、三类详情、状态聚合、allowedActions、物流/合同/保单/支付资产入口、取消规则、客服上下文。</w:t>
+              <w:t>订单总览、分类和组合筛选、搜索和排序、订单卡片、三类详情、状态聚合、服务端允许操作清单、物流/合同/保单/支付资产入口、取消规则、客服上下文。</w:t>
             </w:r>
           </w:p>
         </w:tc>
@@ -363,7 +363,7 @@
     </w:p>
     <w:p>
       <w:r>
-        <w:t>订单总览、分类和组合筛选、搜索和排序、订单卡片、三类详情、状态聚合、allowedActions、物流/合同/保单/支付资产入口、取消规则、客服上下文。</w:t>
+        <w:t>订单总览、分类和组合筛选、搜索和排序、订单卡片、三类详情、状态聚合、服务端允许操作清单、物流/合同/保单/支付资产入口、取消规则、客服上下文。</w:t>
       </w:r>
     </w:p>
     <w:p>
@@ -827,7 +827,7 @@
                 <w:color w:val="FFFFFF"/>
                 <w:sz w:val="16"/>
               </w:rPr>
-              <w:t>状态码</w:t>
+              <w:t>业务状态</w:t>
             </w:r>
           </w:p>
         </w:tc>
@@ -915,7 +915,7 @@
                 <w:color w:val="000000"/>
                 <w:sz w:val="16"/>
               </w:rPr>
-              <w:t>CUSTOMER_ACTION</w:t>
+              <w:t>待客户处理</w:t>
             </w:r>
           </w:p>
         </w:tc>
@@ -1001,7 +1001,7 @@
                 <w:color w:val="000000"/>
                 <w:sz w:val="16"/>
               </w:rPr>
-              <w:t>FULFILLING</w:t>
+              <w:t>履约中</w:t>
             </w:r>
           </w:p>
         </w:tc>
@@ -1089,7 +1089,7 @@
                 <w:color w:val="000000"/>
                 <w:sz w:val="16"/>
               </w:rPr>
-              <w:t>ACTIVE</w:t>
+              <w:t>服务中</w:t>
             </w:r>
           </w:p>
         </w:tc>
@@ -1175,7 +1175,7 @@
                 <w:color w:val="000000"/>
                 <w:sz w:val="16"/>
               </w:rPr>
-              <w:t>EXPIRING</w:t>
+              <w:t>即将到期</w:t>
             </w:r>
           </w:p>
         </w:tc>
@@ -1263,7 +1263,7 @@
                 <w:color w:val="000000"/>
                 <w:sz w:val="16"/>
               </w:rPr>
-              <w:t>AFTER_SALE</w:t>
+              <w:t>售后中</w:t>
             </w:r>
           </w:p>
         </w:tc>
@@ -1349,7 +1349,7 @@
                 <w:color w:val="000000"/>
                 <w:sz w:val="16"/>
               </w:rPr>
-              <w:t>COMPLETED</w:t>
+              <w:t>已完成</w:t>
             </w:r>
           </w:p>
         </w:tc>
@@ -1437,7 +1437,7 @@
                 <w:color w:val="000000"/>
                 <w:sz w:val="16"/>
               </w:rPr>
-              <w:t>CANCELLED</w:t>
+              <w:t>已取消</w:t>
             </w:r>
           </w:p>
         </w:tc>
@@ -1519,7 +1519,7 @@
           <w:color w:val="000000"/>
           <w:sz w:val="21"/>
         </w:rPr>
-        <w:t>状态码是跨端契约，中文文案允许国际化配置但不得作为业务判断条件。</w:t>
+        <w:t>业务状态是跨端共同口径；多语言文案只负责展示，不作为业务判断条件。</w:t>
       </w:r>
     </w:p>
     <w:p>
@@ -1533,7 +1533,7 @@
           <w:color w:val="000000"/>
           <w:sz w:val="21"/>
         </w:rPr>
-        <w:t>详情接口返回 orderVersion 或 aggregateVersion；任何写操作必须携带该版本并处理409并发冲突。</w:t>
+        <w:t>详情接口返回 订单数据版本 或 聚合数据版本；任何写操作必须携带该版本并处理数据版本冲突并发冲突。</w:t>
       </w:r>
     </w:p>
     <w:p>
@@ -1735,7 +1735,7 @@
                 <w:color w:val="000000"/>
                 <w:sz w:val="17"/>
               </w:rPr>
-              <w:t>页面字段</w:t>
+              <w:t>页面内容</w:t>
             </w:r>
           </w:p>
         </w:tc>
@@ -1869,7 +1869,7 @@
           <w:color w:val="000000"/>
           <w:sz w:val="21"/>
         </w:rPr>
-        <w:t>主按钮在提交期间禁用并显示加载态；返回结果前重复点击复用同一 Idempotency-Key。</w:t>
+        <w:t>主按钮在提交期间禁用并显示加载态；返回结果前重复点击复用同一 幂等请求标识。</w:t>
       </w:r>
     </w:p>
     <w:p>
@@ -2127,7 +2127,7 @@
                 <w:color w:val="000000"/>
                 <w:sz w:val="17"/>
               </w:rPr>
-              <w:t>页面字段</w:t>
+              <w:t>页面内容</w:t>
             </w:r>
           </w:p>
         </w:tc>
@@ -2147,7 +2147,7 @@
                 <w:color w:val="000000"/>
                 <w:sz w:val="17"/>
               </w:rPr>
-              <w:t>业务类型、订单号、商品/仓位/箱数、权威状态、状态说明、风险提示、创建时间、更新时间、allowedActions</w:t>
+              <w:t>业务类型、订单号、商品/仓位/箱数、权威状态、状态说明、风险提示、创建时间、更新时间、服务端允许操作清单</w:t>
             </w:r>
           </w:p>
         </w:tc>
@@ -2261,7 +2261,7 @@
           <w:color w:val="000000"/>
           <w:sz w:val="21"/>
         </w:rPr>
-        <w:t>主按钮在提交期间禁用并显示加载态；返回结果前重复点击复用同一 Idempotency-Key。</w:t>
+        <w:t>主按钮在提交期间禁用并显示加载态；返回结果前重复点击复用同一 幂等请求标识。</w:t>
       </w:r>
     </w:p>
     <w:p>
@@ -2519,7 +2519,7 @@
                 <w:color w:val="000000"/>
                 <w:sz w:val="17"/>
               </w:rPr>
-              <w:t>页面字段</w:t>
+              <w:t>页面内容</w:t>
             </w:r>
           </w:p>
         </w:tc>
@@ -2653,7 +2653,7 @@
           <w:color w:val="000000"/>
           <w:sz w:val="21"/>
         </w:rPr>
-        <w:t>主按钮在提交期间禁用并显示加载态；返回结果前重复点击复用同一 Idempotency-Key。</w:t>
+        <w:t>主按钮在提交期间禁用并显示加载态；返回结果前重复点击复用同一 幂等请求标识。</w:t>
       </w:r>
     </w:p>
     <w:p>
@@ -2911,7 +2911,7 @@
                 <w:color w:val="000000"/>
                 <w:sz w:val="17"/>
               </w:rPr>
-              <w:t>页面字段</w:t>
+              <w:t>页面内容</w:t>
             </w:r>
           </w:p>
         </w:tc>
@@ -3045,7 +3045,7 @@
           <w:color w:val="000000"/>
           <w:sz w:val="21"/>
         </w:rPr>
-        <w:t>主按钮在提交期间禁用并显示加载态；返回结果前重复点击复用同一 Idempotency-Key。</w:t>
+        <w:t>主按钮在提交期间禁用并显示加载态；返回结果前重复点击复用同一 幂等请求标识。</w:t>
       </w:r>
     </w:p>
     <w:p>
@@ -3303,7 +3303,7 @@
                 <w:color w:val="000000"/>
                 <w:sz w:val="17"/>
               </w:rPr>
-              <w:t>页面字段</w:t>
+              <w:t>页面内容</w:t>
             </w:r>
           </w:p>
         </w:tc>
@@ -3323,7 +3323,7 @@
                 <w:color w:val="000000"/>
                 <w:sz w:val="17"/>
               </w:rPr>
-              <w:t>商品/SKU/数量、收货地址快照、金额、支付、配送、物流、确认收货、售后时限</w:t>
+              <w:t>商品/商品规格/数量、收货地址快照、金额、支付、配送、物流、确认收货、售后时限</w:t>
             </w:r>
           </w:p>
         </w:tc>
@@ -3437,7 +3437,7 @@
           <w:color w:val="000000"/>
           <w:sz w:val="21"/>
         </w:rPr>
-        <w:t>主按钮在提交期间禁用并显示加载态；返回结果前重复点击复用同一 Idempotency-Key。</w:t>
+        <w:t>主按钮在提交期间禁用并显示加载态；返回结果前重复点击复用同一 幂等请求标识。</w:t>
       </w:r>
     </w:p>
     <w:p>
@@ -3654,7 +3654,7 @@
                 <w:color w:val="000000"/>
                 <w:sz w:val="17"/>
               </w:rPr>
-              <w:t>页面字段</w:t>
+              <w:t>页面内容</w:t>
             </w:r>
           </w:p>
         </w:tc>
@@ -3788,7 +3788,7 @@
           <w:color w:val="000000"/>
           <w:sz w:val="21"/>
         </w:rPr>
-        <w:t>主按钮在提交期间禁用并显示加载态；返回结果前重复点击复用同一 Idempotency-Key。</w:t>
+        <w:t>主按钮在提交期间禁用并显示加载态；返回结果前重复点击复用同一 幂等请求标识。</w:t>
       </w:r>
     </w:p>
     <w:p>
@@ -3930,7 +3930,7 @@
                 <w:color w:val="FFFFFF"/>
                 <w:sz w:val="15"/>
               </w:rPr>
-              <w:t>字段与内容</w:t>
+              <w:t>内容</w:t>
             </w:r>
           </w:p>
         </w:tc>
@@ -4084,7 +4084,7 @@
                 <w:color w:val="000000"/>
                 <w:sz w:val="15"/>
               </w:rPr>
-              <w:t>根据 businessType 切换，不显示不适用字段</w:t>
+              <w:t>根据 业务类型 切换，不显示不适用字段</w:t>
             </w:r>
           </w:p>
         </w:tc>
@@ -4415,7 +4415,7 @@
                 <w:color w:val="000000"/>
                 <w:sz w:val="15"/>
               </w:rPr>
-              <w:t>逐对象返回 objectVersion；部分召回时按箱体分别显示</w:t>
+              <w:t>逐对象返回 对象数据版本；部分召回时按箱体分别显示</w:t>
             </w:r>
           </w:p>
         </w:tc>
@@ -4483,7 +4483,7 @@
                 <w:color w:val="000000"/>
                 <w:sz w:val="15"/>
               </w:rPr>
-              <w:t>通过 relationType + relationId 跳转；返回订单详情后强制刷新</w:t>
+              <w:t>通过 关联业务类型和关联业务编号 跳转；返回订单详情后强制刷新</w:t>
             </w:r>
           </w:p>
         </w:tc>
@@ -4528,7 +4528,7 @@
                 <w:color w:val="000000"/>
                 <w:sz w:val="15"/>
               </w:rPr>
-              <w:t>服务端 allowedActions 排序后的主按钮、次按钮、更多操作及联系客服</w:t>
+              <w:t>服务端 服务端允许操作清单 排序后的主按钮、次按钮、更多操作及联系客服</w:t>
             </w:r>
           </w:p>
         </w:tc>
@@ -4620,7 +4620,7 @@
                 <w:color w:val="FFFFFF"/>
                 <w:sz w:val="13"/>
               </w:rPr>
-              <w:t>领域状态</w:t>
+              <w:t>业务状态</w:t>
             </w:r>
           </w:p>
         </w:tc>
@@ -4729,7 +4729,7 @@
                 <w:color w:val="000000"/>
                 <w:sz w:val="13"/>
               </w:rPr>
-              <w:t>LOCKED / PENDING_SIGN</w:t>
+              <w:t>仓位已锁定 / 待签约</w:t>
             </w:r>
           </w:p>
         </w:tc>
@@ -4789,7 +4789,7 @@
                 <w:color w:val="000000"/>
                 <w:sz w:val="13"/>
               </w:rPr>
-              <w:t>SIGN_CONTRACT, CANCEL</w:t>
+              <w:t>签署合同, 取消订单</w:t>
             </w:r>
           </w:p>
         </w:tc>
@@ -4809,7 +4809,7 @@
                 <w:color w:val="000000"/>
                 <w:sz w:val="13"/>
               </w:rPr>
-              <w:t>签署成功→PENDING_PAYMENT；锁定过期→CANCELLED；签署失败停留并可重试</w:t>
+              <w:t>签署成功→待付款；锁定过期→已取消；签署失败停留并可重试</w:t>
             </w:r>
           </w:p>
         </w:tc>
@@ -4835,7 +4835,7 @@
                 <w:color w:val="000000"/>
                 <w:sz w:val="13"/>
               </w:rPr>
-              <w:t>PENDING_PAYMENT</w:t>
+              <w:t>待付款</w:t>
             </w:r>
           </w:p>
         </w:tc>
@@ -4898,7 +4898,7 @@
                 <w:color w:val="000000"/>
                 <w:sz w:val="13"/>
               </w:rPr>
-              <w:t>PAY, CANCEL</w:t>
+              <w:t>付款, 取消订单</w:t>
             </w:r>
           </w:p>
         </w:tc>
@@ -4919,7 +4919,7 @@
                 <w:color w:val="000000"/>
                 <w:sz w:val="13"/>
               </w:rPr>
-              <w:t>支付发起→PAYMENT_CONFIRMING；取消后释放仓位，已扣款则转退款</w:t>
+              <w:t>支付发起→付款确认中；取消后释放仓位，已扣款则转退款</w:t>
             </w:r>
           </w:p>
         </w:tc>
@@ -4944,7 +4944,7 @@
                 <w:color w:val="000000"/>
                 <w:sz w:val="13"/>
               </w:rPr>
-              <w:t>PAYMENT_CONFIRMING</w:t>
+              <w:t>付款确认中</w:t>
             </w:r>
           </w:p>
         </w:tc>
@@ -5004,7 +5004,7 @@
                 <w:color w:val="000000"/>
                 <w:sz w:val="13"/>
               </w:rPr>
-              <w:t>REFRESH_PAYMENT, CONTACT_SUPPORT</w:t>
+              <w:t>刷新付款结果, 联系客服</w:t>
             </w:r>
           </w:p>
         </w:tc>
@@ -5024,7 +5024,7 @@
                 <w:color w:val="000000"/>
                 <w:sz w:val="13"/>
               </w:rPr>
-              <w:t>回调成功→ACTIVATING；明确失败→PENDING_PAYMENT；未知结果禁止再次支付</w:t>
+              <w:t>回调成功→开仓生效中；明确失败→待付款；未知结果禁止再次支付</w:t>
             </w:r>
           </w:p>
         </w:tc>
@@ -5050,7 +5050,7 @@
                 <w:color w:val="000000"/>
                 <w:sz w:val="13"/>
               </w:rPr>
-              <w:t>ACTIVATING</w:t>
+              <w:t>开仓生效中</w:t>
             </w:r>
           </w:p>
         </w:tc>
@@ -5113,7 +5113,7 @@
                 <w:color w:val="000000"/>
                 <w:sz w:val="13"/>
               </w:rPr>
-              <w:t>REFRESH, CONTACT_SUPPORT</w:t>
+              <w:t>刷新进度, 联系客服</w:t>
             </w:r>
           </w:p>
         </w:tc>
@@ -5134,7 +5134,7 @@
                 <w:color w:val="000000"/>
                 <w:sz w:val="13"/>
               </w:rPr>
-              <w:t>全部成功→ACTIVE；部分失败→EXCEPTION并创建后台补偿任务</w:t>
+              <w:t>全部成功→服务中；部分失败→异常处理中并创建后台补偿任务</w:t>
             </w:r>
           </w:p>
         </w:tc>
@@ -5159,7 +5159,7 @@
                 <w:color w:val="000000"/>
                 <w:sz w:val="13"/>
               </w:rPr>
-              <w:t>ACTIVE</w:t>
+              <w:t>服务中</w:t>
             </w:r>
           </w:p>
         </w:tc>
@@ -5219,7 +5219,7 @@
                 <w:color w:val="000000"/>
                 <w:sz w:val="13"/>
               </w:rPr>
-              <w:t>UNLOCK, RENEW, TRANSFER, MOVE_OUT</w:t>
+              <w:t>仓门开锁, 续租, 申请转仓, 申请退租</w:t>
             </w:r>
           </w:p>
         </w:tc>
@@ -5265,7 +5265,7 @@
                 <w:color w:val="000000"/>
                 <w:sz w:val="13"/>
               </w:rPr>
-              <w:t>EXPIRING</w:t>
+              <w:t>即将到期</w:t>
             </w:r>
           </w:p>
         </w:tc>
@@ -5328,7 +5328,7 @@
                 <w:color w:val="000000"/>
                 <w:sz w:val="13"/>
               </w:rPr>
-              <w:t>RENEW, TRANSFER, MOVE_OUT</w:t>
+              <w:t>续租, 申请转仓, 申请退租</w:t>
             </w:r>
           </w:p>
         </w:tc>
@@ -5349,7 +5349,7 @@
                 <w:color w:val="000000"/>
                 <w:sz w:val="13"/>
               </w:rPr>
-              <w:t>续租成功→ACTIVE并更新到期日；到期未续→OVERDUE或COMPLETED，按合同策略</w:t>
+              <w:t>续租成功→服务中并更新到期日；到期未续→逾期或已完成，按合同策略</w:t>
             </w:r>
           </w:p>
         </w:tc>
@@ -5374,7 +5374,7 @@
                 <w:color w:val="000000"/>
                 <w:sz w:val="13"/>
               </w:rPr>
-              <w:t>RENEWING</w:t>
+              <w:t>续租处理中</w:t>
             </w:r>
           </w:p>
         </w:tc>
@@ -5434,7 +5434,7 @@
                 <w:color w:val="000000"/>
                 <w:sz w:val="13"/>
               </w:rPr>
-              <w:t>SIGN_RENEWAL, PAY_RENEWAL, VIEW_PROGRESS</w:t>
+              <w:t>签署续租协议, 支付续租费用, 查看进度</w:t>
             </w:r>
           </w:p>
         </w:tc>
@@ -5454,7 +5454,7 @@
                 <w:color w:val="000000"/>
                 <w:sz w:val="13"/>
               </w:rPr>
-              <w:t>签约→待付款→生效中→ACTIVE；失败停留原租约并展示可恢复动作</w:t>
+              <w:t>签约→待付款→生效中→服务中；失败停留原租约并展示可恢复动作</w:t>
             </w:r>
           </w:p>
         </w:tc>
@@ -5480,7 +5480,7 @@
                 <w:color w:val="000000"/>
                 <w:sz w:val="13"/>
               </w:rPr>
-              <w:t>TRANSFERRING</w:t>
+              <w:t>转仓处理中</w:t>
             </w:r>
           </w:p>
         </w:tc>
@@ -5543,7 +5543,7 @@
                 <w:color w:val="000000"/>
                 <w:sz w:val="13"/>
               </w:rPr>
-              <w:t>RESUBMIT, PAY_TRANSFER, VIEW_PROGRESS, CANCEL_TRANSFER</w:t>
+              <w:t>修改后重新提交, 支付转仓费用, 查看进度, 取消转仓</w:t>
             </w:r>
           </w:p>
         </w:tc>
@@ -5564,7 +5564,7 @@
                 <w:color w:val="000000"/>
                 <w:sz w:val="13"/>
               </w:rPr>
-              <w:t>审批/付款/排期/搬仓逐段推进；验收及门禁切换成功→ACTIVE并替换仓位</w:t>
+              <w:t>审批/付款/排期/搬仓逐段推进；验收及门禁切换成功→服务中并替换仓位</w:t>
             </w:r>
           </w:p>
         </w:tc>
@@ -5589,7 +5589,7 @@
                 <w:color w:val="000000"/>
                 <w:sz w:val="13"/>
               </w:rPr>
-              <w:t>MOVING_OUT</w:t>
+              <w:t>退租处理中</w:t>
             </w:r>
           </w:p>
         </w:tc>
@@ -5649,7 +5649,7 @@
                 <w:color w:val="000000"/>
                 <w:sz w:val="13"/>
               </w:rPr>
-              <w:t>MODIFY_APPOINTMENT, CONFIRM_SETTLEMENT, PAY_BALANCE, VIEW_REFUND</w:t>
+              <w:t>修改预约, 确认结算, 支付补款, 查看退款进度</w:t>
             </w:r>
           </w:p>
         </w:tc>
@@ -5669,7 +5669,7 @@
                 <w:color w:val="000000"/>
                 <w:sz w:val="13"/>
               </w:rPr>
-              <w:t>验收→结算→退款/补款→COMPLETED；验收前按规则可撤销回ACTIVE</w:t>
+              <w:t>验收→结算→退款/补款→已完成；验收前按规则可撤销回服务中</w:t>
             </w:r>
           </w:p>
         </w:tc>
@@ -5695,7 +5695,7 @@
                 <w:color w:val="000000"/>
                 <w:sz w:val="13"/>
               </w:rPr>
-              <w:t>OVERDUE / RESTRICTED</w:t>
+              <w:t>逾期 / 服务受限</w:t>
             </w:r>
           </w:p>
         </w:tc>
@@ -5758,7 +5758,7 @@
                 <w:color w:val="000000"/>
                 <w:sz w:val="13"/>
               </w:rPr>
-              <w:t>PAY_ARREARS, CONTACT_SUPPORT</w:t>
+              <w:t>支付欠款, 联系客服</w:t>
             </w:r>
           </w:p>
         </w:tc>
@@ -5779,7 +5779,7 @@
                 <w:color w:val="000000"/>
                 <w:sz w:val="13"/>
               </w:rPr>
-              <w:t>清欠成功→ACTIVE/EXPIRING；门禁是否保留由服务端单独返回，不由前端推断</w:t>
+              <w:t>清欠成功→服务中/即将到期；门禁是否保留由服务端单独返回，不由前端推断</w:t>
             </w:r>
           </w:p>
         </w:tc>
@@ -5804,7 +5804,7 @@
                 <w:color w:val="000000"/>
                 <w:sz w:val="13"/>
               </w:rPr>
-              <w:t>COMPLETED</w:t>
+              <w:t>已完成</w:t>
             </w:r>
           </w:p>
         </w:tc>
@@ -5864,7 +5864,7 @@
                 <w:color w:val="000000"/>
                 <w:sz w:val="13"/>
               </w:rPr>
-              <w:t>VIEW_ASSETS, BUY_AGAIN</w:t>
+              <w:t>查看关联资料, 再次购买</w:t>
             </w:r>
           </w:p>
         </w:tc>
@@ -5910,7 +5910,7 @@
                 <w:color w:val="000000"/>
                 <w:sz w:val="13"/>
               </w:rPr>
-              <w:t>CANCELLED / EXCEPTION</w:t>
+              <w:t>已取消 / 异常处理中</w:t>
             </w:r>
           </w:p>
         </w:tc>
@@ -5973,7 +5973,7 @@
                 <w:color w:val="000000"/>
                 <w:sz w:val="13"/>
               </w:rPr>
-              <w:t>VIEW_REFUND, RETRY, CONTACT_SUPPORT</w:t>
+              <w:t>查看退款进度, 重试, 联系客服</w:t>
             </w:r>
           </w:p>
         </w:tc>
@@ -6016,7 +6016,7 @@
           <w:color w:val="000000"/>
           <w:sz w:val="21"/>
         </w:rPr>
-        <w:t>迷你仓租用中状态以图4-3为验收基准：顶部摘要、租用进度、仓门开锁主按钮、续租/转仓/退租次按钮和金额区必须同时存在；动作缺失时按 allowedActions 隐藏，不保留空白占位。</w:t>
+        <w:t>迷你仓租用中状态以图4-3为验收基准：顶部摘要、租用进度、仓门开锁主按钮、续租/转仓/退租次按钮和金额区必须同时存在；动作缺失时按 服务端允许操作清单 隐藏，不保留空白占位。</w:t>
       </w:r>
     </w:p>
     <w:p>
@@ -6075,7 +6075,7 @@
                 <w:color w:val="FFFFFF"/>
                 <w:sz w:val="13"/>
               </w:rPr>
-              <w:t>领域状态</w:t>
+              <w:t>业务状态</w:t>
             </w:r>
           </w:p>
         </w:tc>
@@ -6184,7 +6184,7 @@
                 <w:color w:val="000000"/>
                 <w:sz w:val="13"/>
               </w:rPr>
-              <w:t>PENDING_SIGN</w:t>
+              <w:t>待签约</w:t>
             </w:r>
           </w:p>
         </w:tc>
@@ -6244,7 +6244,7 @@
                 <w:color w:val="000000"/>
                 <w:sz w:val="13"/>
               </w:rPr>
-              <w:t>SIGN_CONTRACT, CANCEL</w:t>
+              <w:t>签署合同, 取消订单</w:t>
             </w:r>
           </w:p>
         </w:tc>
@@ -6264,7 +6264,7 @@
                 <w:color w:val="000000"/>
                 <w:sz w:val="13"/>
               </w:rPr>
-              <w:t>签署成功→PENDING_PAYMENT；资料失效要求重新确认订单</w:t>
+              <w:t>签署成功→待付款；资料失效要求重新确认订单</w:t>
             </w:r>
           </w:p>
         </w:tc>
@@ -6290,7 +6290,7 @@
                 <w:color w:val="000000"/>
                 <w:sz w:val="13"/>
               </w:rPr>
-              <w:t>PENDING_PAYMENT</w:t>
+              <w:t>待付款</w:t>
             </w:r>
           </w:p>
         </w:tc>
@@ -6353,7 +6353,7 @@
                 <w:color w:val="000000"/>
                 <w:sz w:val="13"/>
               </w:rPr>
-              <w:t>PAY, CANCEL</w:t>
+              <w:t>付款, 取消订单</w:t>
             </w:r>
           </w:p>
         </w:tc>
@@ -6374,7 +6374,7 @@
                 <w:color w:val="000000"/>
                 <w:sz w:val="13"/>
               </w:rPr>
-              <w:t>支付确认→DELIVERY_SCHEDULING；取消释放时段，已扣款则进入退款</w:t>
+              <w:t>支付确认→待安排送箱；取消释放时段，已扣款则进入退款</w:t>
             </w:r>
           </w:p>
         </w:tc>
@@ -6399,7 +6399,7 @@
                 <w:color w:val="000000"/>
                 <w:sz w:val="13"/>
               </w:rPr>
-              <w:t>PAYMENT_CONFIRMING</w:t>
+              <w:t>付款确认中</w:t>
             </w:r>
           </w:p>
         </w:tc>
@@ -6459,7 +6459,7 @@
                 <w:color w:val="000000"/>
                 <w:sz w:val="13"/>
               </w:rPr>
-              <w:t>REFRESH_PAYMENT, CONTACT_SUPPORT</w:t>
+              <w:t>刷新付款结果, 联系客服</w:t>
             </w:r>
           </w:p>
         </w:tc>
@@ -6505,7 +6505,7 @@
                 <w:color w:val="000000"/>
                 <w:sz w:val="13"/>
               </w:rPr>
-              <w:t>DELIVERY_SCHEDULING</w:t>
+              <w:t>待安排送箱</w:t>
             </w:r>
           </w:p>
         </w:tc>
@@ -6568,7 +6568,7 @@
                 <w:color w:val="000000"/>
                 <w:sz w:val="13"/>
               </w:rPr>
-              <w:t>VIEW_PROGRESS, RESCHEDULE, CANCEL</w:t>
+              <w:t>查看进度, 修改预约, 取消订单</w:t>
             </w:r>
           </w:p>
         </w:tc>
@@ -6589,7 +6589,7 @@
                 <w:color w:val="000000"/>
                 <w:sz w:val="13"/>
               </w:rPr>
-              <w:t>生成送箱工单→EMPTY_BOX_DELIVERING；超过取消截止不返回CANCEL</w:t>
+              <w:t>生成送箱工单→空箱配送中；超过取消截止不返回取消订单</w:t>
             </w:r>
           </w:p>
         </w:tc>
@@ -6614,7 +6614,7 @@
                 <w:color w:val="000000"/>
                 <w:sz w:val="13"/>
               </w:rPr>
-              <w:t>EMPTY_BOX_DELIVERING</w:t>
+              <w:t>空箱配送中</w:t>
             </w:r>
           </w:p>
         </w:tc>
@@ -6674,7 +6674,7 @@
                 <w:color w:val="000000"/>
                 <w:sz w:val="13"/>
               </w:rPr>
-              <w:t>VIEW_LOGISTICS, CONTACT_SERVICE</w:t>
+              <w:t>查看物流, 联系履约人员</w:t>
             </w:r>
           </w:p>
         </w:tc>
@@ -6694,7 +6694,7 @@
                 <w:color w:val="000000"/>
                 <w:sz w:val="13"/>
               </w:rPr>
-              <w:t>逐箱交付成功→EMPTY_BOX_DELIVERED；缺箱/拒收→EXCEPTION</w:t>
+              <w:t>逐箱交付成功→空箱已送达；缺箱/拒收→异常处理中</w:t>
             </w:r>
           </w:p>
         </w:tc>
@@ -6720,7 +6720,7 @@
                 <w:color w:val="000000"/>
                 <w:sz w:val="13"/>
               </w:rPr>
-              <w:t>EMPTY_BOX_DELIVERED</w:t>
+              <w:t>空箱已送达</w:t>
             </w:r>
           </w:p>
         </w:tc>
@@ -6783,7 +6783,7 @@
                 <w:color w:val="000000"/>
                 <w:sz w:val="13"/>
               </w:rPr>
-              <w:t>SCHEDULE_COLLECTION</w:t>
+              <w:t>预约收箱</w:t>
             </w:r>
           </w:p>
         </w:tc>
@@ -6804,7 +6804,7 @@
                 <w:color w:val="000000"/>
                 <w:sz w:val="13"/>
               </w:rPr>
-              <w:t>至少一箱可收才可预约；提交后→COLLECTION_SCHEDULED</w:t>
+              <w:t>至少一箱可收才可预约；提交后→已预约收箱</w:t>
             </w:r>
           </w:p>
         </w:tc>
@@ -6829,7 +6829,7 @@
                 <w:color w:val="000000"/>
                 <w:sz w:val="13"/>
               </w:rPr>
-              <w:t>COLLECTION_SCHEDULED</w:t>
+              <w:t>已预约收箱</w:t>
             </w:r>
           </w:p>
         </w:tc>
@@ -6889,7 +6889,7 @@
                 <w:color w:val="000000"/>
                 <w:sz w:val="13"/>
               </w:rPr>
-              <w:t>RESCHEDULE_COLLECTION, CANCEL_COLLECTION, VIEW_PROGRESS</w:t>
+              <w:t>修改收箱预约, 取消收箱预约, 查看进度</w:t>
             </w:r>
           </w:p>
         </w:tc>
@@ -6909,7 +6909,7 @@
                 <w:color w:val="000000"/>
                 <w:sz w:val="13"/>
               </w:rPr>
-              <w:t>到达取箱→FULL_BOX_COLLECTING；截止前可改期/取消</w:t>
+              <w:t>到达取箱→满箱取件中；截止前可改期/取消</w:t>
             </w:r>
           </w:p>
         </w:tc>
@@ -6935,7 +6935,7 @@
                 <w:color w:val="000000"/>
                 <w:sz w:val="13"/>
               </w:rPr>
-              <w:t>FULL_BOX_COLLECTING</w:t>
+              <w:t>满箱取件中</w:t>
             </w:r>
           </w:p>
         </w:tc>
@@ -6998,7 +6998,7 @@
                 <w:color w:val="000000"/>
                 <w:sz w:val="13"/>
               </w:rPr>
-              <w:t>VIEW_LOGISTICS, CONTACT_SERVICE</w:t>
+              <w:t>查看物流, 联系履约人员</w:t>
             </w:r>
           </w:p>
         </w:tc>
@@ -7019,7 +7019,7 @@
                 <w:color w:val="000000"/>
                 <w:sz w:val="13"/>
               </w:rPr>
-              <w:t>全部收取→WAREHOUSE_INSPECTION；部分失败保留未收箱并标记异常</w:t>
+              <w:t>全部收取→入仓验收中；部分失败保留未收箱并标记异常</w:t>
             </w:r>
           </w:p>
         </w:tc>
@@ -7044,7 +7044,7 @@
                 <w:color w:val="000000"/>
                 <w:sz w:val="13"/>
               </w:rPr>
-              <w:t>WAREHOUSE_INSPECTION</w:t>
+              <w:t>入仓验收中</w:t>
             </w:r>
           </w:p>
         </w:tc>
@@ -7104,7 +7104,7 @@
                 <w:color w:val="000000"/>
                 <w:sz w:val="13"/>
               </w:rPr>
-              <w:t>VIEW_PROGRESS, CONTACT_SUPPORT</w:t>
+              <w:t>查看进度, 联系客服</w:t>
             </w:r>
           </w:p>
         </w:tc>
@@ -7124,7 +7124,7 @@
                 <w:color w:val="000000"/>
                 <w:sz w:val="13"/>
               </w:rPr>
-              <w:t>全部合格→STORED；损坏或封条异常→EXCEPTION待客户/后台确认</w:t>
+              <w:t>全部合格→在仓存放；损坏或封条异常→异常处理中待客户/后台确认</w:t>
             </w:r>
           </w:p>
         </w:tc>
@@ -7150,7 +7150,7 @@
                 <w:color w:val="000000"/>
                 <w:sz w:val="13"/>
               </w:rPr>
-              <w:t>STORED</w:t>
+              <w:t>在仓存放</w:t>
             </w:r>
           </w:p>
         </w:tc>
@@ -7213,7 +7213,7 @@
                 <w:color w:val="000000"/>
                 <w:sz w:val="13"/>
               </w:rPr>
-              <w:t>RECALL, TERMINATE, VIEW_TRANSPORTS</w:t>
+              <w:t>召回取物, 结束租用, 查看运输记录</w:t>
             </w:r>
           </w:p>
         </w:tc>
@@ -7234,7 +7234,7 @@
                 <w:color w:val="000000"/>
                 <w:sz w:val="13"/>
               </w:rPr>
-              <w:t>召回选中箱体→RECALL_DELIVERING；退租需覆盖所有未终止箱体</w:t>
+              <w:t>召回选中箱体→取物配送中；退租需覆盖所有未终止箱体</w:t>
             </w:r>
           </w:p>
         </w:tc>
@@ -7259,7 +7259,7 @@
                 <w:color w:val="000000"/>
                 <w:sz w:val="13"/>
               </w:rPr>
-              <w:t>RECALL_DELIVERING</w:t>
+              <w:t>取物配送中</w:t>
             </w:r>
           </w:p>
         </w:tc>
@@ -7319,7 +7319,7 @@
                 <w:color w:val="000000"/>
                 <w:sz w:val="13"/>
               </w:rPr>
-              <w:t>VIEW_LOGISTICS, CONTACT_SERVICE</w:t>
+              <w:t>查看物流, 联系履约人员</w:t>
             </w:r>
           </w:p>
         </w:tc>
@@ -7339,7 +7339,7 @@
                 <w:color w:val="000000"/>
                 <w:sz w:val="13"/>
               </w:rPr>
-              <w:t>签收→AT_CUSTOMER；拒收/丢损→EXCEPTION，不得覆盖首次履约旅程</w:t>
+              <w:t>签收→箱体在客户处；拒收/丢损→异常处理中，不得覆盖首次履约旅程</w:t>
             </w:r>
           </w:p>
         </w:tc>
@@ -7365,7 +7365,7 @@
                 <w:color w:val="000000"/>
                 <w:sz w:val="13"/>
               </w:rPr>
-              <w:t>AT_CUSTOMER</w:t>
+              <w:t>箱体在客户处</w:t>
             </w:r>
           </w:p>
         </w:tc>
@@ -7428,7 +7428,7 @@
                 <w:color w:val="000000"/>
                 <w:sz w:val="13"/>
               </w:rPr>
-              <w:t>SCHEDULE_RETURN, TERMINATE</w:t>
+              <w:t>预约返仓, 结束租用</w:t>
             </w:r>
           </w:p>
         </w:tc>
@@ -7449,7 +7449,7 @@
                 <w:color w:val="000000"/>
                 <w:sz w:val="13"/>
               </w:rPr>
-              <w:t>预约返仓→RETURN_SCHEDULED；逾期按后台计费策略生成费用</w:t>
+              <w:t>预约返仓→已预约返仓；逾期按后台计费策略生成费用</w:t>
             </w:r>
           </w:p>
         </w:tc>
@@ -7474,7 +7474,7 @@
                 <w:color w:val="000000"/>
                 <w:sz w:val="13"/>
               </w:rPr>
-              <w:t>RETURN_SCHEDULED / RETURNING</w:t>
+              <w:t>已预约返仓 / 返仓运输中</w:t>
             </w:r>
           </w:p>
         </w:tc>
@@ -7534,7 +7534,7 @@
                 <w:color w:val="000000"/>
                 <w:sz w:val="13"/>
               </w:rPr>
-              <w:t>RESCHEDULE_RETURN, VIEW_LOGISTICS</w:t>
+              <w:t>修改返仓预约, 查看物流</w:t>
             </w:r>
           </w:p>
         </w:tc>
@@ -7554,7 +7554,7 @@
                 <w:color w:val="000000"/>
                 <w:sz w:val="13"/>
               </w:rPr>
-              <w:t>收取→运输→入仓验收→STORED；部分箱失败按箱体保留状态</w:t>
+              <w:t>收取→运输→入仓验收→在仓存放；部分箱失败按箱体保留状态</w:t>
             </w:r>
           </w:p>
         </w:tc>
@@ -7580,7 +7580,7 @@
                 <w:color w:val="000000"/>
                 <w:sz w:val="13"/>
               </w:rPr>
-              <w:t>TERMINATING</w:t>
+              <w:t>结束租用处理中</w:t>
             </w:r>
           </w:p>
         </w:tc>
@@ -7643,7 +7643,7 @@
                 <w:color w:val="000000"/>
                 <w:sz w:val="13"/>
               </w:rPr>
-              <w:t>CONFIRM_SETTLEMENT, PAY_BALANCE, VIEW_REFUND</w:t>
+              <w:t>确认结算, 支付补款, 查看退款进度</w:t>
             </w:r>
           </w:p>
         </w:tc>
@@ -7664,7 +7664,7 @@
                 <w:color w:val="000000"/>
                 <w:sz w:val="13"/>
               </w:rPr>
-              <w:t>全部箱体回收且结清→COMPLETED；缺箱/欠费保持处理中</w:t>
+              <w:t>全部箱体回收且结清→已完成；缺箱/欠费保持处理中</w:t>
             </w:r>
           </w:p>
         </w:tc>
@@ -7689,7 +7689,7 @@
                 <w:color w:val="000000"/>
                 <w:sz w:val="13"/>
               </w:rPr>
-              <w:t>COMPLETED / CANCELLED</w:t>
+              <w:t>已完成 / 已取消</w:t>
             </w:r>
           </w:p>
         </w:tc>
@@ -7749,7 +7749,7 @@
                 <w:color w:val="000000"/>
                 <w:sz w:val="13"/>
               </w:rPr>
-              <w:t>VIEW_ASSETS, BUY_AGAIN</w:t>
+              <w:t>查看关联资料, 再次购买</w:t>
             </w:r>
           </w:p>
         </w:tc>
@@ -7795,7 +7795,7 @@
                 <w:color w:val="000000"/>
                 <w:sz w:val="13"/>
               </w:rPr>
-              <w:t>EXCEPTION</w:t>
+              <w:t>异常处理中</w:t>
             </w:r>
           </w:p>
         </w:tc>
@@ -7858,7 +7858,7 @@
                 <w:color w:val="000000"/>
                 <w:sz w:val="13"/>
               </w:rPr>
-              <w:t>RETRY_ALLOWED_ACTION, CONTACT_SUPPORT</w:t>
+              <w:t>重试当前可用操作, 联系客服</w:t>
             </w:r>
           </w:p>
         </w:tc>
@@ -7901,7 +7901,7 @@
           <w:color w:val="000000"/>
           <w:sz w:val="21"/>
         </w:rPr>
-        <w:t>迷你箱待签约以图4-2为验收基准；在仓存放以图4-4和图4-6为验收基准。首次履约完成后仍保留完整历史，召回/返仓以新 journeyId 追加，不覆盖原节点。</w:t>
+        <w:t>迷你箱待签约以图4-2为验收基准；在仓存放以图4-4和图4-6为验收基准。首次履约完成后仍保留完整历史，召回/返仓以新 履约旅程编号 追加，不覆盖原节点。</w:t>
       </w:r>
     </w:p>
     <w:p>
@@ -7954,7 +7954,7 @@
                 <w:color w:val="FFFFFF"/>
                 <w:sz w:val="14"/>
               </w:rPr>
-              <w:t>动作</w:t>
+              <w:t>操作</w:t>
             </w:r>
           </w:p>
         </w:tc>
@@ -8017,7 +8017,7 @@
                 <w:color w:val="FFFFFF"/>
                 <w:sz w:val="14"/>
               </w:rPr>
-              <w:t>成功/失败结果</w:t>
+              <w:t>成功或失败结果</w:t>
             </w:r>
           </w:p>
         </w:tc>
@@ -8042,7 +8042,7 @@
                 <w:color w:val="000000"/>
                 <w:sz w:val="14"/>
               </w:rPr>
-              <w:t>SIGN_CONTRACT</w:t>
+              <w:t>签署合同</w:t>
             </w:r>
           </w:p>
         </w:tc>
@@ -8128,7 +8128,7 @@
                 <w:color w:val="000000"/>
                 <w:sz w:val="14"/>
               </w:rPr>
-              <w:t>PAY / PAY_*</w:t>
+              <w:t>付款及各类业务付款</w:t>
             </w:r>
           </w:p>
         </w:tc>
@@ -8216,7 +8216,7 @@
                 <w:color w:val="000000"/>
                 <w:sz w:val="14"/>
               </w:rPr>
-              <w:t>CANCEL / CANCEL_*</w:t>
+              <w:t>取消订单或取消服务</w:t>
             </w:r>
           </w:p>
         </w:tc>
@@ -8302,7 +8302,7 @@
                 <w:color w:val="000000"/>
                 <w:sz w:val="14"/>
               </w:rPr>
-              <w:t>UNLOCK</w:t>
+              <w:t>仓门开锁</w:t>
             </w:r>
           </w:p>
         </w:tc>
@@ -8390,7 +8390,7 @@
                 <w:color w:val="000000"/>
                 <w:sz w:val="14"/>
               </w:rPr>
-              <w:t>RENEW / TRANSFER / MOVE_OUT</w:t>
+              <w:t>续租 / 申请转仓 / 申请退租</w:t>
             </w:r>
           </w:p>
         </w:tc>
@@ -8430,7 +8430,7 @@
                 <w:color w:val="000000"/>
                 <w:sz w:val="14"/>
               </w:rPr>
-              <w:t>跳转对应申请页并传 rentalId、orderId、orderVersion</w:t>
+              <w:t>跳转对应申请页并传 租约编号、订单编号、订单数据版本</w:t>
             </w:r>
           </w:p>
         </w:tc>
@@ -8476,7 +8476,7 @@
                 <w:color w:val="000000"/>
                 <w:sz w:val="14"/>
               </w:rPr>
-              <w:t>SCHEDULE_* / RESCHEDULE_*</w:t>
+              <w:t>新建或修改预约</w:t>
             </w:r>
           </w:p>
         </w:tc>
@@ -8518,7 +8518,7 @@
                 <w:color w:val="000000"/>
                 <w:sz w:val="14"/>
               </w:rPr>
-              <w:t>选时段并返回 quoteVersion；改期展示旧新时段</w:t>
+              <w:t>选时段并返回 报价版本；改期展示旧新时段</w:t>
             </w:r>
           </w:p>
         </w:tc>
@@ -8564,7 +8564,7 @@
                 <w:color w:val="000000"/>
                 <w:sz w:val="14"/>
               </w:rPr>
-              <w:t>RECALL / SCHEDULE_RETURN</w:t>
+              <w:t>召回取物 / 预约返仓</w:t>
             </w:r>
           </w:p>
         </w:tc>
@@ -8650,7 +8650,7 @@
                 <w:color w:val="000000"/>
                 <w:sz w:val="14"/>
               </w:rPr>
-              <w:t>TERMINATE</w:t>
+              <w:t>结束租用</w:t>
             </w:r>
           </w:p>
         </w:tc>
@@ -8738,7 +8738,7 @@
                 <w:color w:val="000000"/>
                 <w:sz w:val="14"/>
               </w:rPr>
-              <w:t>VIEW_LOGISTICS / VIEW_PROGRESS</w:t>
+              <w:t>查看物流 / 查看进度</w:t>
             </w:r>
           </w:p>
         </w:tc>
@@ -8824,7 +8824,7 @@
                 <w:color w:val="000000"/>
                 <w:sz w:val="14"/>
               </w:rPr>
-              <w:t>CONFIRM_SETTLEMENT / PAY_BALANCE</w:t>
+              <w:t>确认结算 / 支付补款</w:t>
             </w:r>
           </w:p>
         </w:tc>
@@ -8866,7 +8866,7 @@
                 <w:color w:val="000000"/>
                 <w:sz w:val="14"/>
               </w:rPr>
-              <w:t>展示费用证据与版本；确认或付款携带 settlementVersion</w:t>
+              <w:t>展示费用证据与版本；确认或付款携带 结算单版本</w:t>
             </w:r>
           </w:p>
         </w:tc>
@@ -8912,7 +8912,7 @@
                 <w:color w:val="000000"/>
                 <w:sz w:val="14"/>
               </w:rPr>
-              <w:t>CONTACT_SUPPORT</w:t>
+              <w:t>联系客服</w:t>
             </w:r>
           </w:p>
         </w:tc>
@@ -9016,7 +9016,7 @@
           <w:color w:val="000000"/>
           <w:sz w:val="21"/>
         </w:rPr>
-        <w:t>allowedActions 必须包含 actionId、code、label、style、priority、route、confirmContent、expiresAt、disabledReason 和 actionVersion；客户端只负责展示与提交。</w:t>
+        <w:t>服务端允许操作清单 必须包含 操作记录编号、结果编号、按钮文案、按钮样式、显示优先级、跳转页面、二次确认内容、操作失效时间、不可操作原因 和 操作清单版本；客户端只负责展示与提交。</w:t>
       </w:r>
     </w:p>
     <w:p>
@@ -9044,7 +9044,7 @@
           <w:color w:val="000000"/>
           <w:sz w:val="21"/>
         </w:rPr>
-        <w:t>状态变化以领域事件为准；支付回调、工单回传、后台审批到达后递增 orderVersion，并使旧页面写操作返回409。</w:t>
+        <w:t>状态变化以领域事件为准；支付回调、工单回传、后台审批到达后递增 订单数据版本，并使旧页面写操作返回数据版本冲突。</w:t>
       </w:r>
     </w:p>
     <w:p>
@@ -9072,7 +9072,7 @@
           <w:color w:val="000000"/>
           <w:sz w:val="21"/>
         </w:rPr>
-        <w:t>时间线节点必须包含 eventId、journeyId、objectIds、status、occurredAt、operatorType、customerText；内部备注和员工手机号不得下发。</w:t>
+        <w:t>时间线节点必须包含 事件编号、履约旅程编号、业务对象编号清单、节点状态、发生时间、操作方类型、客户可见说明；内部备注和员工手机号不得下发。</w:t>
       </w:r>
     </w:p>
     <w:p>
@@ -9086,7 +9086,7 @@
           <w:color w:val="000000"/>
           <w:sz w:val="21"/>
         </w:rPr>
-        <w:t>从通知、客服或外链进入详情时先校验登录、订单归属和 businessType；无权不可泄露订单是否存在。</w:t>
+        <w:t>从通知、客服或外链进入详情时先校验登录、订单归属和 业务类型；无权不可泄露订单是否存在。</w:t>
       </w:r>
     </w:p>
     <w:p>
@@ -9122,7 +9122,7 @@
           <w:color w:val="000000"/>
           <w:sz w:val="21"/>
         </w:rPr>
-        <w:t>列表默认按‘需客户处理优先、同类按业务进度、再按更新时间倒序’排序；服务端返回 sortKey，客户端不得仅凭中文状态推断。</w:t>
+        <w:t>列表默认按‘需客户处理优先、同类按业务进度、再按更新时间倒序’排序；服务端返回 服务端排序值，客户端不得仅凭中文状态推断。</w:t>
       </w:r>
     </w:p>
     <w:p>
@@ -9136,7 +9136,7 @@
           <w:color w:val="000000"/>
           <w:sz w:val="21"/>
         </w:rPr>
-        <w:t>搜索匹配订单号、商品、门店、仓位和服务端提供的 searchableText；输入300毫秒防抖，关键字最长50字符。</w:t>
+        <w:t>搜索匹配订单号、商品、门店、仓位和服务端提供的 可搜索文本；输入300毫秒防抖，关键字最长50字符。</w:t>
       </w:r>
     </w:p>
     <w:p>
@@ -9164,7 +9164,7 @@
           <w:color w:val="000000"/>
           <w:sz w:val="21"/>
         </w:rPr>
-        <w:t>列表使用游标分页，首次20条、后续20条；筛选变化取消旧请求，按 queryVersion 丢弃乱序响应。</w:t>
+        <w:t>列表使用游标分页，首次20条、后续20条；筛选变化取消旧请求，按 查询版本 丢弃乱序响应。</w:t>
       </w:r>
     </w:p>
     <w:p>
@@ -9192,7 +9192,7 @@
           <w:color w:val="000000"/>
           <w:sz w:val="21"/>
         </w:rPr>
-        <w:t>详情以 orderVersion 做并发控制；从列表进入先显示快照并立即刷新，服务端新版本覆盖缓存。</w:t>
+        <w:t>详情以 订单数据版本 做并发控制；从列表进入先显示快照并立即刷新，服务端新版本覆盖缓存。</w:t>
       </w:r>
     </w:p>
     <w:p>
@@ -9206,7 +9206,7 @@
           <w:color w:val="000000"/>
           <w:sz w:val="21"/>
         </w:rPr>
-        <w:t>所有按钮完全依据 allowedActions 数组渲染，动作对象包含 code、label、style、route、confirm、expiresAt、disabledReason。客户端不得按状态硬编码越权动作。</w:t>
+        <w:t>所有按钮完全依据 服务端允许操作清单 数组渲染，动作对象包含 结果编号、按钮文案、按钮样式、跳转页面、是否二次确认、操作失效时间、不可操作原因。客户端不得按状态硬编码越权动作。</w:t>
       </w:r>
     </w:p>
     <w:p>
@@ -9220,7 +9220,7 @@
           <w:color w:val="000000"/>
           <w:sz w:val="21"/>
         </w:rPr>
-        <w:t>写操作携带 Idempotency-Key、orderVersion 和 traceId；409刷新详情并提示状态已变化，禁止本地强改状态。</w:t>
+        <w:t>写操作携带 幂等请求标识、订单数据版本 和 链路追踪编号；数据版本冲突刷新详情并提示状态已变化，禁止本地强改状态。</w:t>
       </w:r>
     </w:p>
     <w:p>
@@ -9234,7 +9234,7 @@
           <w:color w:val="000000"/>
           <w:sz w:val="21"/>
         </w:rPr>
-        <w:t>迷你箱必须同时展示‘首次履约’和‘召回与取物’旅程，后者不得覆盖前者；箱体状态按 boxId 独立展示。</w:t>
+        <w:t>迷你箱必须同时展示‘首次履约’和‘召回与取物’旅程，后者不得覆盖前者；箱体状态按 箱体编号 独立展示。</w:t>
       </w:r>
     </w:p>
     <w:p>
@@ -9262,7 +9262,7 @@
           <w:color w:val="000000"/>
           <w:sz w:val="21"/>
         </w:rPr>
-        <w:t>客服入口必须传 orderId、businessType、statusCode、lastEventId 和客户问题预填，不允许客服页固定示例订单。</w:t>
+        <w:t>客服入口必须传 订单编号、业务类型、状态编号、最后事件编号 和客户问题预填，不允许客服页固定示例订单。</w:t>
       </w:r>
     </w:p>
     <w:p>
@@ -9645,7 +9645,7 @@
                 <w:color w:val="000000"/>
                 <w:sz w:val="15"/>
               </w:rPr>
-              <w:t>获取详情、version和allowedActions</w:t>
+              <w:t>获取订单详情、数据版本和允许操作清单</w:t>
             </w:r>
           </w:p>
         </w:tc>
@@ -10035,7 +10035,7 @@
           <w:color w:val="000000"/>
           <w:sz w:val="21"/>
         </w:rPr>
-        <w:t>响应通用字段：code、message、data、traceId、serverTime；分页使用 nextCursor；金额使用整数最小货币单位。</w:t>
+        <w:t>本节是研发技术信息，接口地址按系统约定保留；每个接口均用中文说明业务用途。</w:t>
       </w:r>
     </w:p>
     <w:p>
@@ -10049,7 +10049,7 @@
           <w:color w:val="000000"/>
           <w:sz w:val="21"/>
         </w:rPr>
-        <w:t>写接口必须校验登录用户与资源归属；Idempotency-Key 建议保留24小时，重复请求返回首次业务结果。</w:t>
+        <w:t>统一响应需返回处理结果、提示信息、业务数据、链路追踪编号和服务器时间；分页返回下一页游标；金额使用整数最小货币单位。</w:t>
       </w:r>
     </w:p>
     <w:p>
@@ -10063,7 +10063,21 @@
           <w:color w:val="000000"/>
           <w:sz w:val="21"/>
         </w:rPr>
-        <w:t>错误码至少区分 VALIDATION_ERROR、NOT_ELIGIBLE、VERSION_CONFLICT、RESOURCE_LOCKED、PAYMENT_PENDING、FORBIDDEN 和 SERVICE_UNAVAILABLE。</w:t>
+        <w:t>写接口必须校验登录用户与资源归属；幂等请求标识建议保留24小时，重复请求返回首次业务结果。</w:t>
+      </w:r>
+    </w:p>
+    <w:p>
+      <w:pPr>
+        <w:pStyle w:val="ListBullet"/>
+        <w:spacing w:after="60"/>
+      </w:pPr>
+      <w:r>
+        <w:rPr>
+          <w:rFonts w:ascii="Arial" w:hAnsi="Arial" w:eastAsia="Microsoft YaHei"/>
+          <w:color w:val="000000"/>
+          <w:sz w:val="21"/>
+        </w:rPr>
+        <w:t>错误需明确区分参数错误、无操作资格、数据版本冲突、资源锁定、付款确认中、无权限和服务不可用。</w:t>
       </w:r>
     </w:p>
     <w:p>
@@ -10180,7 +10194,7 @@
                 <w:color w:val="000000"/>
                 <w:sz w:val="17"/>
               </w:rPr>
-              <w:t>小程序只调用BFF或领域服务；提交后后台通过同一业务单据查看、审批或异常处理，不接受直接写后台数据库。</w:t>
+              <w:t>小程序只调用订单聚合服务或领域服务；提交后后台通过同一业务单据查看、审批或异常处理，不接受直接写后台数据库。</w:t>
             </w:r>
           </w:p>
         </w:tc>
@@ -10272,7 +10286,7 @@
                 <w:color w:val="000000"/>
                 <w:sz w:val="17"/>
               </w:rPr>
-              <w:t>需要线下执行时生成 workOrderId，包含orderId、任务类型、时间窗、地点、对象清单、SLA和附件要求。</w:t>
+              <w:t>需要线下执行时生成工单编号，并关联订单编号、任务类型、时间窗、地点、对象清单、处理时限和附件要求。</w:t>
             </w:r>
           </w:p>
         </w:tc>
@@ -10364,7 +10378,7 @@
                 <w:color w:val="000000"/>
                 <w:sz w:val="17"/>
               </w:rPr>
-              <w:t>关键节点通过订阅消息/站内消息发送，payload仅带业务编号与深链，不包含敏感合同或门禁凭证。</w:t>
+              <w:t>关键节点通过订阅消息或站内消息发送，消息内容仅带业务编号与页面入口，不包含敏感合同或门禁凭证。</w:t>
             </w:r>
           </w:p>
         </w:tc>
@@ -10394,7 +10408,7 @@
           <w:color w:val="000000"/>
           <w:sz w:val="21"/>
         </w:rPr>
-        <w:t>order.snapshot_updated：事件必须包含 eventId、aggregateId、aggregateVersion、occurredAt、operatorType、traceId。</w:t>
+        <w:t>订单快照已更新：事件必须包含事件编号、业务单据编号、数据版本、发生时间、操作方类型和链路追踪编号。</w:t>
       </w:r>
     </w:p>
     <w:p>
@@ -10408,7 +10422,7 @@
           <w:color w:val="000000"/>
           <w:sz w:val="21"/>
         </w:rPr>
-        <w:t>order.action_requested：事件必须包含 eventId、aggregateId、aggregateVersion、occurredAt、operatorType、traceId。</w:t>
+        <w:t>客户已发起订单操作：事件必须包含事件编号、业务单据编号、数据版本、发生时间、操作方类型和链路追踪编号。</w:t>
       </w:r>
     </w:p>
     <w:p>
@@ -10422,7 +10436,7 @@
           <w:color w:val="000000"/>
           <w:sz w:val="21"/>
         </w:rPr>
-        <w:t>order.status_changed：事件必须包含 eventId、aggregateId、aggregateVersion、occurredAt、operatorType、traceId。</w:t>
+        <w:t>订单状态已变化：事件必须包含事件编号、业务单据编号、数据版本、发生时间、操作方类型和链路追踪编号。</w:t>
       </w:r>
     </w:p>
     <w:p>
@@ -10436,7 +10450,7 @@
           <w:color w:val="000000"/>
           <w:sz w:val="21"/>
         </w:rPr>
-        <w:t>order.cancelled：事件必须包含 eventId、aggregateId、aggregateVersion、occurredAt、operatorType、traceId。</w:t>
+        <w:t>订单已取消：事件必须包含事件编号、业务单据编号、数据版本、发生时间、操作方类型和链路追踪编号。</w:t>
       </w:r>
     </w:p>
     <w:p>
@@ -10450,7 +10464,7 @@
           <w:color w:val="000000"/>
           <w:sz w:val="21"/>
         </w:rPr>
-        <w:t>order.asset_attached：事件必须包含 eventId、aggregateId、aggregateVersion、occurredAt、operatorType、traceId。</w:t>
+        <w:t>订单已关联新资料：事件必须包含事件编号、业务单据编号、数据版本、发生时间、操作方类型和链路追踪编号。</w:t>
       </w:r>
     </w:p>
     <w:p>
@@ -10464,7 +10478,7 @@
           <w:color w:val="000000"/>
           <w:sz w:val="21"/>
         </w:rPr>
-        <w:t>order.timeline_appended：事件必须包含 eventId、aggregateId、aggregateVersion、occurredAt、operatorType、traceId。</w:t>
+        <w:t>订单时间线已追加节点：事件必须包含事件编号、业务单据编号、数据版本、发生时间、操作方类型和链路追踪编号。</w:t>
       </w:r>
     </w:p>
     <w:p>
@@ -10623,7 +10637,7 @@
                 <w:color w:val="000000"/>
                 <w:sz w:val="16"/>
               </w:rPr>
-              <w:t>返回 partial=true 和失败域；展示其他订单并提供局部重试</w:t>
+              <w:t>返回 标记为部分成功 和失败域；展示其他订单并提供局部重试</w:t>
             </w:r>
           </w:p>
         </w:tc>
@@ -10670,7 +10684,7 @@
                 <w:color w:val="000000"/>
                 <w:sz w:val="16"/>
               </w:rPr>
-              <w:t>写操作 orderVersion 冲突</w:t>
+              <w:t>写操作 订单数据版本 冲突</w:t>
             </w:r>
           </w:p>
         </w:tc>
@@ -11040,7 +11054,7 @@
                 <w:color w:val="FFFFFF"/>
                 <w:sz w:val="14"/>
               </w:rPr>
-              <w:t>领域状态</w:t>
+              <w:t>业务状态</w:t>
             </w:r>
           </w:p>
         </w:tc>
@@ -11061,7 +11075,7 @@
                 <w:color w:val="FFFFFF"/>
                 <w:sz w:val="14"/>
               </w:rPr>
-              <w:t>聚合状态</w:t>
+              <w:t>客户侧分类</w:t>
             </w:r>
           </w:p>
         </w:tc>
@@ -11168,7 +11182,7 @@
                 <w:color w:val="000000"/>
                 <w:sz w:val="14"/>
               </w:rPr>
-              <w:t>CUSTOMER_ACTION</w:t>
+              <w:t>待客户处理</w:t>
             </w:r>
           </w:p>
         </w:tc>
@@ -11188,7 +11202,7 @@
                 <w:color w:val="000000"/>
                 <w:sz w:val="14"/>
               </w:rPr>
-              <w:t>SIGN_CONTRACT, PAY, CANCEL</w:t>
+              <w:t>签署合同, 付款, 取消订单</w:t>
             </w:r>
           </w:p>
         </w:tc>
@@ -11276,7 +11290,7 @@
                 <w:color w:val="000000"/>
                 <w:sz w:val="14"/>
               </w:rPr>
-              <w:t>ACTIVE</w:t>
+              <w:t>服务中</w:t>
             </w:r>
           </w:p>
         </w:tc>
@@ -11297,7 +11311,7 @@
                 <w:color w:val="000000"/>
                 <w:sz w:val="14"/>
               </w:rPr>
-              <w:t>UNLOCK, RENEW, TRANSFER, MOVE_OUT</w:t>
+              <w:t>仓门开锁, 续租, 申请转仓, 申请退租</w:t>
             </w:r>
           </w:p>
         </w:tc>
@@ -11383,7 +11397,7 @@
                 <w:color w:val="000000"/>
                 <w:sz w:val="14"/>
               </w:rPr>
-              <w:t>EXPIRING</w:t>
+              <w:t>即将到期</w:t>
             </w:r>
           </w:p>
         </w:tc>
@@ -11403,7 +11417,7 @@
                 <w:color w:val="000000"/>
                 <w:sz w:val="14"/>
               </w:rPr>
-              <w:t>RENEW, TRANSFER, MOVE_OUT</w:t>
+              <w:t>续租, 申请转仓, 申请退租</w:t>
             </w:r>
           </w:p>
         </w:tc>
@@ -11491,7 +11505,7 @@
                 <w:color w:val="000000"/>
                 <w:sz w:val="14"/>
               </w:rPr>
-              <w:t>CUSTOMER_ACTION</w:t>
+              <w:t>待客户处理</w:t>
             </w:r>
           </w:p>
         </w:tc>
@@ -11512,7 +11526,7 @@
                 <w:color w:val="000000"/>
                 <w:sz w:val="14"/>
               </w:rPr>
-              <w:t>SIGN_RENEWAL, PAY</w:t>
+              <w:t>签署续租协议, 付款</w:t>
             </w:r>
           </w:p>
         </w:tc>
@@ -11598,7 +11612,7 @@
                 <w:color w:val="000000"/>
                 <w:sz w:val="14"/>
               </w:rPr>
-              <w:t>FULFILLING</w:t>
+              <w:t>履约中</w:t>
             </w:r>
           </w:p>
         </w:tc>
@@ -11618,7 +11632,7 @@
                 <w:color w:val="000000"/>
                 <w:sz w:val="14"/>
               </w:rPr>
-              <w:t>VIEW_PROGRESS, PAY_TRANSFER, RESUBMIT</w:t>
+              <w:t>查看进度, 支付转仓费用, 修改后重新提交</w:t>
             </w:r>
           </w:p>
         </w:tc>
@@ -11706,7 +11720,7 @@
                 <w:color w:val="000000"/>
                 <w:sz w:val="14"/>
               </w:rPr>
-              <w:t>FULFILLING</w:t>
+              <w:t>履约中</w:t>
             </w:r>
           </w:p>
         </w:tc>
@@ -11727,7 +11741,7 @@
                 <w:color w:val="000000"/>
                 <w:sz w:val="14"/>
               </w:rPr>
-              <w:t>VIEW_PROGRESS, MODIFY_APPOINTMENT</w:t>
+              <w:t>查看进度, 修改预约</w:t>
             </w:r>
           </w:p>
         </w:tc>
@@ -11813,7 +11827,7 @@
                 <w:color w:val="000000"/>
                 <w:sz w:val="14"/>
               </w:rPr>
-              <w:t>CUSTOMER_ACTION</w:t>
+              <w:t>待客户处理</w:t>
             </w:r>
           </w:p>
         </w:tc>
@@ -11833,7 +11847,7 @@
                 <w:color w:val="000000"/>
                 <w:sz w:val="14"/>
               </w:rPr>
-              <w:t>SIGN_CONTRACT, PAY, CANCEL</w:t>
+              <w:t>签署合同, 付款, 取消订单</w:t>
             </w:r>
           </w:p>
         </w:tc>
@@ -11921,7 +11935,7 @@
                 <w:color w:val="000000"/>
                 <w:sz w:val="14"/>
               </w:rPr>
-              <w:t>FULFILLING</w:t>
+              <w:t>履约中</w:t>
             </w:r>
           </w:p>
         </w:tc>
@@ -11942,7 +11956,7 @@
                 <w:color w:val="000000"/>
                 <w:sz w:val="14"/>
               </w:rPr>
-              <w:t>VIEW_PROGRESS, CANCEL</w:t>
+              <w:t>查看进度, 取消订单</w:t>
             </w:r>
           </w:p>
         </w:tc>
@@ -12028,7 +12042,7 @@
                 <w:color w:val="000000"/>
                 <w:sz w:val="14"/>
               </w:rPr>
-              <w:t>FULFILLING</w:t>
+              <w:t>履约中</w:t>
             </w:r>
           </w:p>
         </w:tc>
@@ -12048,7 +12062,7 @@
                 <w:color w:val="000000"/>
                 <w:sz w:val="14"/>
               </w:rPr>
-              <w:t>SCHEDULE_COLLECTION</w:t>
+              <w:t>预约收箱</w:t>
             </w:r>
           </w:p>
         </w:tc>
@@ -12136,7 +12150,7 @@
                 <w:color w:val="000000"/>
                 <w:sz w:val="14"/>
               </w:rPr>
-              <w:t>ACTIVE</w:t>
+              <w:t>服务中</w:t>
             </w:r>
           </w:p>
         </w:tc>
@@ -12157,7 +12171,7 @@
                 <w:color w:val="000000"/>
                 <w:sz w:val="14"/>
               </w:rPr>
-              <w:t>RECALL, TERMINATE</w:t>
+              <w:t>召回取物, 结束租用</w:t>
             </w:r>
           </w:p>
         </w:tc>
@@ -12243,7 +12257,7 @@
                 <w:color w:val="000000"/>
                 <w:sz w:val="14"/>
               </w:rPr>
-              <w:t>FULFILLING</w:t>
+              <w:t>履约中</w:t>
             </w:r>
           </w:p>
         </w:tc>
@@ -12263,7 +12277,7 @@
                 <w:color w:val="000000"/>
                 <w:sz w:val="14"/>
               </w:rPr>
-              <w:t>VIEW_LOGISTICS</w:t>
+              <w:t>查看物流</w:t>
             </w:r>
           </w:p>
         </w:tc>
@@ -12351,7 +12365,7 @@
                 <w:color w:val="000000"/>
                 <w:sz w:val="14"/>
               </w:rPr>
-              <w:t>FULFILLING</w:t>
+              <w:t>履约中</w:t>
             </w:r>
           </w:p>
         </w:tc>
@@ -12372,7 +12386,7 @@
                 <w:color w:val="000000"/>
                 <w:sz w:val="14"/>
               </w:rPr>
-              <w:t>SCHEDULE_RETURN, TERMINATE</w:t>
+              <w:t>预约返仓, 结束租用</w:t>
             </w:r>
           </w:p>
         </w:tc>
@@ -12458,7 +12472,7 @@
                 <w:color w:val="000000"/>
                 <w:sz w:val="14"/>
               </w:rPr>
-              <w:t>CUSTOMER_ACTION</w:t>
+              <w:t>待客户处理</w:t>
             </w:r>
           </w:p>
         </w:tc>
@@ -12478,7 +12492,7 @@
                 <w:color w:val="000000"/>
                 <w:sz w:val="14"/>
               </w:rPr>
-              <w:t>PAY, CANCEL</w:t>
+              <w:t>付款, 取消订单</w:t>
             </w:r>
           </w:p>
         </w:tc>
@@ -12566,7 +12580,7 @@
                 <w:color w:val="000000"/>
                 <w:sz w:val="14"/>
               </w:rPr>
-              <w:t>FULFILLING</w:t>
+              <w:t>履约中</w:t>
             </w:r>
           </w:p>
         </w:tc>
@@ -12587,7 +12601,7 @@
                 <w:color w:val="000000"/>
                 <w:sz w:val="14"/>
               </w:rPr>
-              <w:t>VIEW_LOGISTICS, CONFIRM_RECEIPT</w:t>
+              <w:t>查看物流, 确认收货</w:t>
             </w:r>
           </w:p>
         </w:tc>
@@ -12673,7 +12687,7 @@
                 <w:color w:val="000000"/>
                 <w:sz w:val="14"/>
               </w:rPr>
-              <w:t>COMPLETED</w:t>
+              <w:t>已完成</w:t>
             </w:r>
           </w:p>
         </w:tc>
@@ -12693,7 +12707,7 @@
                 <w:color w:val="000000"/>
                 <w:sz w:val="14"/>
               </w:rPr>
-              <w:t>AFTER_SALE, BUY_AGAIN</w:t>
+              <w:t>售后中, 再次购买</w:t>
             </w:r>
           </w:p>
         </w:tc>
@@ -12743,7 +12757,7 @@
           <w:color w:val="000000"/>
           <w:sz w:val="21"/>
         </w:rPr>
-        <w:t>性能：列表首屏P95不超过2秒，详情P95不超过1.5秒，写操作受理P95不超过2秒；长流程以受理结果加异步进度返回。</w:t>
+        <w:t>性能：百分之九十五的请求中，列表首屏不超过2秒、详情不超过1.5秒、写操作受理不超过2秒；长流程先返回受理结果，再异步更新进度。</w:t>
       </w:r>
     </w:p>
     <w:p>
@@ -12757,7 +12771,7 @@
           <w:color w:val="000000"/>
           <w:sz w:val="21"/>
         </w:rPr>
-        <w:t>可用性：读取接口目标99.9%，写接口失败不得留下不可识别中间态；跨服务写入使用事务消息或outbox补偿。</w:t>
+        <w:t>可用性：读取接口目标99.9%，写接口失败不得留下不可识别中间态；跨服务写入使用事务消息或可靠事件表补偿。</w:t>
       </w:r>
     </w:p>
     <w:p>
@@ -12771,7 +12785,7 @@
           <w:color w:val="000000"/>
           <w:sz w:val="21"/>
         </w:rPr>
-        <w:t>安全：手机号、地址、签名、门禁凭证和支付数据按最小权限展示；日志脱敏，下载资产使用短时签名URL。</w:t>
+        <w:t>安全：手机号、地址、签名、门禁凭证和支付数据按最小权限展示；日志脱敏，下载资料使用有时效的安全地址。</w:t>
       </w:r>
     </w:p>
     <w:p>
@@ -12785,7 +12799,7 @@
           <w:color w:val="000000"/>
           <w:sz w:val="21"/>
         </w:rPr>
-        <w:t>审计：所有状态变更记录前后值、操作者、来源端、原因码、时间和traceId；客户可见文案与内部备注分离。</w:t>
+        <w:t>审计：所有状态变更记录前后值、操作者、来源端、原因码、时间和链路追踪编号；客户可见文案与内部备注分离。</w:t>
       </w:r>
     </w:p>
     <w:p>
@@ -12932,7 +12946,7 @@
                 <w:color w:val="000000"/>
                 <w:sz w:val="16"/>
               </w:rPr>
-              <w:t>page_view</w:t>
+              <w:t>页面访问</w:t>
             </w:r>
           </w:p>
         </w:tc>
@@ -12972,7 +12986,7 @@
                 <w:color w:val="000000"/>
                 <w:sz w:val="16"/>
               </w:rPr>
-              <w:t>pageCode、source、orderId可选、businessType</w:t>
+              <w:t>页面名称、进入来源、订单编号、业务类型</w:t>
             </w:r>
           </w:p>
         </w:tc>
@@ -12998,7 +13012,7 @@
                 <w:color w:val="000000"/>
                 <w:sz w:val="16"/>
               </w:rPr>
-              <w:t>action_click</w:t>
+              <w:t>操作点击</w:t>
             </w:r>
           </w:p>
         </w:tc>
@@ -13040,7 +13054,7 @@
                 <w:color w:val="000000"/>
                 <w:sz w:val="16"/>
               </w:rPr>
-              <w:t>actionCode、statusCode、allowed、orderVersion</w:t>
+              <w:t>操作名称、当前状态、是否允许、订单数据版本</w:t>
             </w:r>
           </w:p>
         </w:tc>
@@ -13065,7 +13079,7 @@
                 <w:color w:val="000000"/>
                 <w:sz w:val="16"/>
               </w:rPr>
-              <w:t>submit_result</w:t>
+              <w:t>提交结果</w:t>
             </w:r>
           </w:p>
         </w:tc>
@@ -13105,7 +13119,7 @@
                 <w:color w:val="000000"/>
                 <w:sz w:val="16"/>
               </w:rPr>
-              <w:t>requestId、result、errorCode、durationMs、traceId</w:t>
+              <w:t>请求编号、处理结果、失败原因、处理时长、链路追踪编号</w:t>
             </w:r>
           </w:p>
         </w:tc>
@@ -13131,7 +13145,7 @@
                 <w:color w:val="000000"/>
                 <w:sz w:val="16"/>
               </w:rPr>
-              <w:t>flow_step_changed</w:t>
+              <w:t>流程节点变化</w:t>
             </w:r>
           </w:p>
         </w:tc>
@@ -13173,7 +13187,7 @@
                 <w:color w:val="000000"/>
                 <w:sz w:val="16"/>
               </w:rPr>
-              <w:t>fromStatus、toStatus、eventId、operatorType</w:t>
+              <w:t>原状态、新状态、事件编号、操作方类型</w:t>
             </w:r>
           </w:p>
         </w:tc>
@@ -13203,7 +13217,7 @@
           <w:color w:val="000000"/>
           <w:sz w:val="21"/>
         </w:rPr>
-        <w:t>AC-01 三类订单数量、列表结果和筛选条件一致，切换分类不会串数据。</w:t>
+        <w:t>验收项01 三类订单数量、列表结果和筛选条件一致，切换分类不会串数据。</w:t>
       </w:r>
     </w:p>
     <w:p>
@@ -13217,7 +13231,7 @@
           <w:color w:val="000000"/>
           <w:sz w:val="21"/>
         </w:rPr>
-        <w:t>AC-02 关键词可命中订单号、门店、仓位、箱号或商品名，清空后恢复当前分类全量。</w:t>
+        <w:t>验收项02 关键词可命中订单号、门店、仓位、箱号或商品名，清空后恢复当前分类全量。</w:t>
       </w:r>
     </w:p>
     <w:p>
@@ -13231,7 +13245,7 @@
           <w:color w:val="000000"/>
           <w:sz w:val="21"/>
         </w:rPr>
-        <w:t>AC-03 订单状态变化后，旧页面执行动作收到409并刷新为最新状态。</w:t>
+        <w:t>验收项03 订单状态变化后，旧页面执行动作收到数据版本冲突并刷新为最新状态。</w:t>
       </w:r>
     </w:p>
     <w:p>
@@ -13245,7 +13259,7 @@
           <w:color w:val="000000"/>
           <w:sz w:val="21"/>
         </w:rPr>
-        <w:t>AC-04 服务端移除某个 allowedAction 后，客户端刷新即隐藏对应按钮。</w:t>
+        <w:t>验收项04 服务端移除某个 允许操作 后，客户端刷新即隐藏对应按钮。</w:t>
       </w:r>
     </w:p>
     <w:p>
@@ -13259,7 +13273,7 @@
           <w:color w:val="000000"/>
           <w:sz w:val="21"/>
         </w:rPr>
-        <w:t>AC-05 迷你箱部分召回时，详情同时显示未召回箱体在仓和召回箱体配送中。</w:t>
+        <w:t>验收项05 迷你箱部分召回时，详情同时显示未召回箱体在仓和召回箱体配送中。</w:t>
       </w:r>
     </w:p>
     <w:p>
@@ -13273,7 +13287,7 @@
           <w:color w:val="000000"/>
           <w:sz w:val="21"/>
         </w:rPr>
-        <w:t>AC-06 迷你仓待签约订单展示合同和付款主操作；租用中订单展示开锁、续租、转仓、退租。</w:t>
+        <w:t>验收项06 迷你仓待签约订单展示合同和付款主操作；租用中订单展示开锁、续租、转仓、退租。</w:t>
       </w:r>
     </w:p>
     <w:p>
@@ -13287,7 +13301,7 @@
           <w:color w:val="000000"/>
           <w:sz w:val="21"/>
         </w:rPr>
-        <w:t>AC-07 待付款订单重复点击支付只复用或安全创建新的支付尝试，不产生重复扣款。</w:t>
+        <w:t>验收项07 待付款订单重复点击支付只复用或安全创建新的支付尝试，不产生重复扣款。</w:t>
       </w:r>
     </w:p>
     <w:p>
@@ -13301,7 +13315,7 @@
           <w:color w:val="000000"/>
           <w:sz w:val="21"/>
         </w:rPr>
-        <w:t>AC-08 符合条件的迷你箱取消后释放送箱时段；已付款订单显示退款处理中。</w:t>
+        <w:t>验收项08 符合条件的迷你箱取消后释放送箱时段；已付款订单显示退款处理中。</w:t>
       </w:r>
     </w:p>
     <w:p>
@@ -13315,7 +13329,7 @@
           <w:color w:val="000000"/>
           <w:sz w:val="21"/>
         </w:rPr>
-        <w:t>AC-09 订单详情所有时间来自服务端并按客户时区显示，原始时间保留UTC。</w:t>
+        <w:t>验收项09 订单详情所有时间来自服务端并按客户时区显示，原始时间保留协调世界时。</w:t>
       </w:r>
     </w:p>
     <w:p>
@@ -13329,7 +13343,7 @@
           <w:color w:val="000000"/>
           <w:sz w:val="21"/>
         </w:rPr>
-        <w:t>AC-10 接口超时、空列表、无网络、无权限、订单不存在均有独立可恢复页面状态。</w:t>
+        <w:t>验收项10 接口超时、空列表、无网络、无权限、订单不存在均有独立可恢复页面状态。</w:t>
       </w:r>
     </w:p>
     <w:p>
@@ -13532,7 +13546,7 @@
                 <w:color w:val="000000"/>
                 <w:sz w:val="17"/>
               </w:rPr>
-              <w:t>BFF与领域后端</w:t>
+              <w:t>订单聚合服务与领域后端</w:t>
             </w:r>
           </w:p>
         </w:tc>
@@ -13552,7 +13566,7 @@
                 <w:color w:val="000000"/>
                 <w:sz w:val="17"/>
               </w:rPr>
-              <w:t>OpenAPI、状态机、幂等、权限、事件、补偿任务和审计</w:t>
+              <w:t>接口定义、状态机、幂等、权限、事件、补偿任务和审计</w:t>
             </w:r>
           </w:p>
         </w:tc>

</xml_diff>

<commit_message>
docs(order): publish Chinese terminology
</commit_message>
<xml_diff>
--- a/requirements/downloads/11_订单管理_PRD_V2.0.docx
+++ b/requirements/downloads/11_订单管理_PRD_V2.0.docx
@@ -237,7 +237,7 @@
                 <w:color w:val="000000"/>
                 <w:sz w:val="18"/>
               </w:rPr>
-              <w:t>订单总览、分类和组合筛选、搜索和排序、订单卡片、三类详情、状态聚合、服务端允许操作清单、物流/合同/保单/支付资产入口、取消规则、客服上下文。</w:t>
+              <w:t>订单总览、分类和组合筛选、搜索和排序、订单卡片、三类详情、状态聚合、允许操作清单、物流/合同/保单/支付资产入口、取消规则、客服上下文。</w:t>
             </w:r>
           </w:p>
         </w:tc>
@@ -363,7 +363,7 @@
     </w:p>
     <w:p>
       <w:r>
-        <w:t>订单总览、分类和组合筛选、搜索和排序、订单卡片、三类详情、状态聚合、服务端允许操作清单、物流/合同/保单/支付资产入口、取消规则、客服上下文。</w:t>
+        <w:t>订单总览、分类和组合筛选、搜索和排序、订单卡片、三类详情、状态聚合、允许操作清单、物流/合同/保单/支付资产入口、取消规则、客服上下文。</w:t>
       </w:r>
     </w:p>
     <w:p>
@@ -1533,7 +1533,7 @@
           <w:color w:val="000000"/>
           <w:sz w:val="21"/>
         </w:rPr>
-        <w:t>详情接口返回 订单数据版本 或 聚合数据版本；任何写操作必须携带该版本并处理数据版本冲突并发冲突。</w:t>
+        <w:t>详情接口需返回数据版本；任何写操作必须携带当前版本，发生版本冲突时刷新详情并提示客户。</w:t>
       </w:r>
     </w:p>
     <w:p>
@@ -2147,7 +2147,7 @@
                 <w:color w:val="000000"/>
                 <w:sz w:val="17"/>
               </w:rPr>
-              <w:t>业务类型、订单号、商品/仓位/箱数、权威状态、状态说明、风险提示、创建时间、更新时间、服务端允许操作清单</w:t>
+              <w:t>业务类型、订单号、商品/仓位/箱数、权威状态、状态说明、风险提示、创建时间、更新时间、允许操作清单</w:t>
             </w:r>
           </w:p>
         </w:tc>
@@ -4528,7 +4528,7 @@
                 <w:color w:val="000000"/>
                 <w:sz w:val="15"/>
               </w:rPr>
-              <w:t>服务端 服务端允许操作清单 排序后的主按钮、次按钮、更多操作及联系客服</w:t>
+              <w:t>服务端 允许操作清单 排序后的主按钮、次按钮、更多操作及联系客服</w:t>
             </w:r>
           </w:p>
         </w:tc>
@@ -6016,7 +6016,7 @@
           <w:color w:val="000000"/>
           <w:sz w:val="21"/>
         </w:rPr>
-        <w:t>迷你仓租用中状态以图4-3为验收基准：顶部摘要、租用进度、仓门开锁主按钮、续租/转仓/退租次按钮和金额区必须同时存在；动作缺失时按 服务端允许操作清单 隐藏，不保留空白占位。</w:t>
+        <w:t>迷你仓租用中状态以图4-3为验收基准：顶部摘要、租用进度、仓门开锁主按钮、续租/转仓/退租次按钮和金额区必须同时存在；动作缺失时按 允许操作清单 隐藏，不保留空白占位。</w:t>
       </w:r>
     </w:p>
     <w:p>
@@ -9016,7 +9016,7 @@
           <w:color w:val="000000"/>
           <w:sz w:val="21"/>
         </w:rPr>
-        <w:t>服务端允许操作清单 必须包含 操作记录编号、结果编号、按钮文案、按钮样式、显示优先级、跳转页面、二次确认内容、操作失效时间、不可操作原因 和 操作清单版本；客户端只负责展示与提交。</w:t>
+        <w:t>允许操作清单 必须包含 操作记录编号、结果编号、按钮文案、按钮样式、显示优先级、跳转页面、二次确认内容、操作失效时间、不可操作原因 和 操作清单版本；客户端只负责展示与提交。</w:t>
       </w:r>
     </w:p>
     <w:p>
@@ -9206,7 +9206,7 @@
           <w:color w:val="000000"/>
           <w:sz w:val="21"/>
         </w:rPr>
-        <w:t>所有按钮完全依据 服务端允许操作清单 数组渲染，动作对象包含 结果编号、按钮文案、按钮样式、跳转页面、是否二次确认、操作失效时间、不可操作原因。客户端不得按状态硬编码越权动作。</w:t>
+        <w:t>所有按钮完全依据 允许操作清单 数组渲染，动作对象包含 结果编号、按钮文案、按钮样式、跳转页面、是否二次确认、操作失效时间、不可操作原因。客户端不得按状态硬编码越权动作。</w:t>
       </w:r>
     </w:p>
     <w:p>

</xml_diff>